<commit_message>
Clases de 60 minutos en toda la oferta
- Desarrollo de Clases: estructura de sesion a 60 min (quiz 5 +
  leccion 30 + practica oral 20 + cierre 5); el drilling pesado queda
  en el Lector como tarea
- Programa de Cursos: duraciones a 60 minutos (11h / 8h lectivas)
- Web: /nivel-1 (FAQ, hero e incluye) y tarjeta de Courses de 90 a
  60 min

Co-Authored-By: Claude Fable 5 <noreply@anthropic.com>
</commit_message>
<xml_diff>
--- a/Programa_Cursos_Octubre_2026.docx
+++ b/Programa_Cursos_Octubre_2026.docx
@@ -1794,7 +1794,7 @@
                 <w:sz w:val="21"/>
                 <w:szCs w:val="21"/>
               </w:rPr>
-              <w:t xml:space="preserve">11 sesiones · 90 minutos (16,5 horas lectivas) · 1 clase por semana</w:t>
+              <w:t xml:space="preserve">11 sesiones · 60 minutos (11 horas lectivas) · 1 clase por semana</w:t>
             </w:r>
           </w:p>
         </w:tc>
@@ -3768,7 +3768,7 @@
                 <w:sz w:val="21"/>
                 <w:szCs w:val="21"/>
               </w:rPr>
-              <w:t xml:space="preserve">8 sesiones · 90 minutos (12 horas lectivas) · 1 clase por semana</w:t>
+              <w:t xml:space="preserve">8 sesiones · 60 minutos (8 horas lectivas) · 1 clase por semana</w:t>
             </w:r>
           </w:p>
         </w:tc>

</xml_diff>

<commit_message>
Profe de Ninos confirmado: Jay y Abby (web ES/EN/KO, PDFs de programa, posts del boletin, email)
- lib/nivel1.ts: PROFES.ninos = "Jay y Abby · 김재희 · 홍미영" con bio nueva; label de la clase con el profe
- Diccionarios EN/KO con las 4 claves nuevas (919)
- public/programas: 6 docx+pdf regenerados desde nivel1.ts (sin "por confirmar")
- Boletin IG: portada y KOR 050 actualizados; caption de Ninos
- Email de lanzamiento: fila Ninos con "Jay y Abby"; CLAUDE.md sin el pendiente

Co-Authored-By: Claude Opus 5 <noreply@anthropic.com>
</commit_message>
<xml_diff>
--- a/Programa_Cursos_Octubre_2026.docx
+++ b/Programa_Cursos_Octubre_2026.docx
@@ -2400,7 +2400,7 @@
                 <w:sz w:val="20"/>
                 <w:szCs w:val="20"/>
               </w:rPr>
-              <w:t xml:space="preserve">Profesor/a por confirmar</w:t>
+              <w:t xml:space="preserve">Jay y Abby · 김재희 · 홍미영</w:t>
             </w:r>
           </w:p>
         </w:tc>
@@ -9854,7 +9854,7 @@
           <w:sz w:val="20"/>
           <w:szCs w:val="20"/>
         </w:rPr>
-        <w:t xml:space="preserve">Lunes 18:00 · por confirmar</w:t>
+        <w:t xml:space="preserve">Lunes 18:00 · Jay y Abby</w:t>
       </w:r>
     </w:p>
     <w:tbl>
@@ -11681,7 +11681,7 @@
                 <w:sz w:val="20"/>
                 <w:szCs w:val="20"/>
               </w:rPr>
-              <w:t xml:space="preserve">Profesor/a de Niños (por confirmar)</w:t>
+              <w:t xml:space="preserve">Jay y Abby · 김재희 · 홍미영</w:t>
             </w:r>
           </w:p>
         </w:tc>
@@ -11735,7 +11735,7 @@
                 <w:sz w:val="20"/>
                 <w:szCs w:val="20"/>
               </w:rPr>
-              <w:t xml:space="preserve">Docente con experiencia en clases para 8–12 años. Te lo presentamos por WhatsApp antes de que pagues.</w:t>
+              <w:t xml:space="preserve">Dos profes coreanos nativos para la clase de niños: Jay (fundador, criado en Chile) y Abby (pedagoga). Juegos, canciones y dibujos en un grupo de máximo 12.</w:t>
             </w:r>
           </w:p>
         </w:tc>

</xml_diff>

<commit_message>
Links cortos /p/ a los programas para el embudo de ventas y programas corregidos (fechas de Ninos 19 oct-7 dic, formato de clase por curso, nombres oficiales, sin cursos inexistentes ni promesas sin confirmar)
Co-Authored-By: Claude Opus 5.5 <noreply@anthropic.com>
</commit_message>
<xml_diff>
--- a/Programa_Cursos_Octubre_2026.docx
+++ b/Programa_Cursos_Octubre_2026.docx
@@ -683,7 +683,7 @@
                 <w:sz w:val="20"/>
                 <w:szCs w:val="20"/>
               </w:rPr>
-              <w:t xml:space="preserve">Conversacional 1 / TOPIK I</w:t>
+              <w:t xml:space="preserve">Conversacional 1</w:t>
             </w:r>
           </w:p>
         </w:tc>
@@ -958,7 +958,7 @@
                 <w:sz w:val="20"/>
                 <w:szCs w:val="20"/>
               </w:rPr>
-              <w:t xml:space="preserve">TOPIK I-2 / B1</w:t>
+              <w:t xml:space="preserve">Intermedio (B1)</w:t>
             </w:r>
           </w:p>
         </w:tc>
@@ -1233,7 +1233,7 @@
                 <w:sz w:val="20"/>
                 <w:szCs w:val="20"/>
               </w:rPr>
-              <w:t xml:space="preserve">Niños 2 / Básico 1</w:t>
+              <w:t xml:space="preserve">Básico 1 desde los 13</w:t>
             </w:r>
           </w:p>
         </w:tc>
@@ -5656,22 +5656,6 @@
         </w:tc>
       </w:tr>
     </w:tbl>
-    <w:p>
-      <w:pPr>
-        <w:spacing w:before="80"/>
-      </w:pPr>
-      <w:r>
-        <w:rPr>
-          <w:rFonts w:ascii="Arial" w:cs="Arial" w:eastAsia="Arial" w:hAnsi="Arial"/>
-          <w:i/>
-          <w:iCs/>
-          <w:color w:val="5C5F6B"/>
-          <w:sz w:val="18"/>
-          <w:szCs w:val="18"/>
-        </w:rPr>
-        <w:t xml:space="preserve">* El 12 oct es feriado en Chile; esa clase se confirma con el grupo.</w:t>
-      </w:r>
-    </w:p>
     <w:p>
       <w:pPr>
         <w:keepNext/>

</xml_diff>